<commit_message>
docs: kullanım kılavuzu + formüller dokümanlarını yeni yapıya güncelle
Form alanı açıklamaları kritik değişikliklere göre düzeltildi (KULLANIM_KILAVUZU
ve FORMULLER, hem .md hem .docx):
- Açınım EN/BOY + Tabaka Başı Kutu → tek "Açınım (adet)"; Sipariş Miktarı otomatik
- Ondüle TL/m² → Oluklu Cinsi + Oluklu TL/m²
- Geçiş Sayısı → Geçiş Çarpanı (otomatik) + Ek Geçiş Adedi (otomatik)
- Baskı Adedi otomatik; Renk Seçimi (renk_multi) eklendi
- Lak/Sıvama kutucukları → "Kesim, Yapıştırma & İlave İşlemler" grubu (fiyatlı)
- Ofset Sevkiyat'tan Kalıp Gideri kaldırıldı (Baskı'da)
- Koli: Baskı Türü → Baskı Durumu; Dikiş Adedi → Dikiş Fiyatı; İlave İşlemler
- Kâr oranı yüzde alanı; otomatik alanların mavi gösterimi; Açıklama satırı notu

Co-Authored-By: Claude Opus 4.8 <noreply@anthropic.com>
</commit_message>
<xml_diff>
--- a/FORMULLER.docx
+++ b/FORMULLER.docx
@@ -559,11 +559,7 @@
         <w:pStyle w:val="Heading2"/>
       </w:pPr>
       <w:r>
-        <w:rPr>
-          <w:color w:val="1E3A5F"/>
-          <w:sz w:val="28"/>
-        </w:rPr>
-        <w:t>Tabaka Başı Kutu (kısaca "kutu/tab")</w:t>
+        <w:t>Tabaka Başı Kutu (kısaca "kutu/tab") — formda artık "Açınım (adet)" alanına girilir</w:t>
       </w:r>
     </w:p>
     <w:p/>
@@ -916,16 +912,7 @@
         <w:pStyle w:val="ListBullet"/>
       </w:pPr>
       <w:r>
-        <w:rPr>
-          <w:b/>
-        </w:rPr>
-        <w:t>Açınım EN ve BOY</w:t>
-      </w:r>
-      <w:r>
-        <w:rPr>
-          <w:b w:val="0"/>
-        </w:rPr>
-        <w:t xml:space="preserve"> — ürünün açılmış ölçüleri</w:t>
+        <w:t>Açınım (adet) — 1 tabakadan kaç kutu çıkar, tek sayı (önemli!)</w:t>
       </w:r>
     </w:p>
     <w:p>
@@ -933,16 +920,7 @@
         <w:pStyle w:val="ListBullet"/>
       </w:pPr>
       <w:r>
-        <w:rPr>
-          <w:b/>
-        </w:rPr>
-        <w:t>Tabaka Başı Kutu</w:t>
-      </w:r>
-      <w:r>
-        <w:rPr>
-          <w:b w:val="0"/>
-        </w:rPr>
-        <w:t xml:space="preserve"> — 1 tabakadan kaç kutu (önemli!)</w:t>
+        <w:t>Sipariş Miktarı (otomatik) — Tabaka Adedi × Açınım</w:t>
       </w:r>
     </w:p>
     <w:p>
@@ -1031,16 +1009,7 @@
         <w:pStyle w:val="ListBullet"/>
       </w:pPr>
       <w:r>
-        <w:rPr>
-          <w:b/>
-        </w:rPr>
-        <w:t>Ondüle TL/m²</w:t>
-      </w:r>
-      <w:r>
-        <w:rPr>
-          <w:b w:val="0"/>
-        </w:rPr>
-        <w:t xml:space="preserve"> — çift duvarlı yapıyorsanız (yoksa 0)</w:t>
+        <w:t>Oluklu Cinsi + Oluklu TL/m² — çift duvarlı yapıyorsanız (yoksa boş)</w:t>
       </w:r>
     </w:p>
     <w:p/>
@@ -1095,16 +1064,7 @@
         <w:pStyle w:val="ListBullet"/>
       </w:pPr>
       <w:r>
-        <w:rPr>
-          <w:b/>
-        </w:rPr>
-        <w:t>Geçiş Sayısı</w:t>
-      </w:r>
-      <w:r>
-        <w:rPr>
-          <w:b w:val="0"/>
-        </w:rPr>
-        <w:t xml:space="preserve"> (genelde 1; özel kaplamalarda 2)</w:t>
+        <w:t>Renk Seçimi — renk sayısı kadar rengi paletten seç (CMYK 4 renkte otomatik)</w:t>
       </w:r>
     </w:p>
     <w:p>
@@ -1112,16 +1072,7 @@
         <w:pStyle w:val="ListBullet"/>
       </w:pPr>
       <w:r>
-        <w:rPr>
-          <w:b/>
-        </w:rPr>
-        <w:t>Baskı Kalıp TL</w:t>
-      </w:r>
-      <w:r>
-        <w:rPr>
-          <w:b w:val="0"/>
-        </w:rPr>
-        <w:t xml:space="preserve"> — kalıp ücreti (yeniyse müşteri öder)</w:t>
+        <w:t>Geçiş Çarpanı (boş → renk sayısına göre otomatik) + Ek Geçiş Adedi (otomatik, 3000 üstü)</w:t>
       </w:r>
     </w:p>
     <w:p>
@@ -1132,13 +1083,13 @@
         <w:rPr>
           <w:b/>
         </w:rPr>
-        <w:t>Boya TL</w:t>
+        <w:t>Baskı Kalıp TL</w:t>
       </w:r>
       <w:r>
         <w:rPr>
           <w:b w:val="0"/>
         </w:rPr>
-        <w:t xml:space="preserve"> — özel mürekkep masrafı varsa</w:t>
+        <w:t xml:space="preserve"> — kalıp ücreti (yeniyse müşteri öder)</w:t>
       </w:r>
     </w:p>
     <w:p>
@@ -1149,13 +1100,21 @@
         <w:rPr>
           <w:b/>
         </w:rPr>
-        <w:t>Baskı Adedi</w:t>
+        <w:t>Boya TL</w:t>
       </w:r>
       <w:r>
         <w:rPr>
           <w:b w:val="0"/>
         </w:rPr>
-        <w:t xml:space="preserve"> — kaç tabaka basılacak (genelde tabaka adedi ile aynı)</w:t>
+        <w:t xml:space="preserve"> — özel mürekkep masrafı varsa</w:t>
+      </w:r>
+    </w:p>
+    <w:p>
+      <w:pPr>
+        <w:pStyle w:val="ListBullet"/>
+      </w:pPr>
+      <w:r>
+        <w:t>Baskı Adedi (otomatik = tabaka adedi)</w:t>
       </w:r>
     </w:p>
     <w:p/>
@@ -1176,16 +1135,7 @@
         <w:pStyle w:val="ListBullet"/>
       </w:pPr>
       <w:r>
-        <w:rPr>
-          <w:b/>
-        </w:rPr>
-        <w:t>Lak</w:t>
-      </w:r>
-      <w:r>
-        <w:rPr>
-          <w:b w:val="0"/>
-        </w:rPr>
-        <w:t xml:space="preserve"> kutusu — varsa işaretle</w:t>
+        <w:t>Kesim TL (tabaka başına) + Yapıştırma TL/adet</w:t>
       </w:r>
     </w:p>
     <w:p>
@@ -1193,16 +1143,7 @@
         <w:pStyle w:val="ListBullet"/>
       </w:pPr>
       <w:r>
-        <w:rPr>
-          <w:b/>
-        </w:rPr>
-        <w:t>Sıvama</w:t>
-      </w:r>
-      <w:r>
-        <w:rPr>
-          <w:b w:val="0"/>
-        </w:rPr>
-        <w:t xml:space="preserve"> kutusu — varsa işaretle</w:t>
+        <w:t>Lak / Sıvama vb. — işaretleyip TL/m² fiyatını elle yaz (müdahaleye açık)</w:t>
       </w:r>
     </w:p>
     <w:p>
@@ -1213,13 +1154,13 @@
         <w:rPr>
           <w:b/>
         </w:rPr>
-        <w:t>İlave İşlemler</w:t>
+        <w:t>Eklenti</w:t>
       </w:r>
       <w:r>
         <w:rPr>
           <w:b w:val="0"/>
         </w:rPr>
-        <w:t xml:space="preserve"> — Mat Selefon, UV Lak, Gofre, Pencere Kesim vs. (birden fazla seçebilirsiniz)</w:t>
+        <w:t xml:space="preserve"> — Kilitli, Yapıştırma veya Dikiş</w:t>
       </w:r>
     </w:p>
     <w:p>
@@ -1227,16 +1168,7 @@
         <w:pStyle w:val="ListBullet"/>
       </w:pPr>
       <w:r>
-        <w:rPr>
-          <w:b/>
-        </w:rPr>
-        <w:t>Eklenti</w:t>
-      </w:r>
-      <w:r>
-        <w:rPr>
-          <w:b w:val="0"/>
-        </w:rPr>
-        <w:t xml:space="preserve"> — Kilitli, Yapıştırma veya Dikiş</w:t>
+        <w:t>İlave İşlemler — Lak/Sıvama vb. işaretleyip TL/m² fiyatını yaz</w:t>
       </w:r>
     </w:p>
     <w:p/>
@@ -1291,33 +1223,7 @@
         <w:pStyle w:val="ListBullet"/>
       </w:pPr>
       <w:r>
-        <w:rPr>
-          <w:b/>
-        </w:rPr>
-        <w:t>Kalıp Gideri</w:t>
-      </w:r>
-      <w:r>
-        <w:rPr>
-          <w:b w:val="0"/>
-        </w:rPr>
-        <w:t xml:space="preserve"> — yeni kalıp masrafı (tek seferlik)</w:t>
-      </w:r>
-    </w:p>
-    <w:p>
-      <w:pPr>
-        <w:pStyle w:val="ListBullet"/>
-      </w:pPr>
-      <w:r>
-        <w:rPr>
-          <w:b/>
-        </w:rPr>
-        <w:t>Diğer Gider</w:t>
-      </w:r>
-      <w:r>
-        <w:rPr>
-          <w:b w:val="0"/>
-        </w:rPr>
-        <w:t xml:space="preserve"> — prova, tasarım vs.</w:t>
+        <w:t>Diğer Gider — prova, tasarım vs. (Kalıp Gideri kaldırıldı; Baskı'daki 'Baskı Kalıp TL'ye girilir)</w:t>
       </w:r>
     </w:p>
     <w:p>
@@ -2879,34 +2785,7 @@
         <w:pStyle w:val="ListBullet"/>
       </w:pPr>
       <w:r>
-        <w:rPr>
-          <w:b/>
-        </w:rPr>
-        <w:t>Levha EN ve BOY</w:t>
-      </w:r>
-      <w:r>
-        <w:rPr>
-          <w:b w:val="0"/>
-        </w:rPr>
-        <w:t xml:space="preserve">, </w:t>
-      </w:r>
-      <w:r>
-        <w:rPr>
-          <w:b/>
-        </w:rPr>
-        <w:t>Tabaka Başı Kutu</w:t>
-      </w:r>
-      <w:r>
-        <w:rPr>
-          <w:b w:val="0"/>
-        </w:rPr>
-        <w:t xml:space="preserve">, </w:t>
-      </w:r>
-      <w:r>
-        <w:rPr>
-          <w:b/>
-        </w:rPr>
-        <w:t>Tabaka Adedi</w:t>
+        <w:t>Levha EN ve BOY, Açınım (adet), Tabaka Adedi — Sipariş Miktarı otomatik</w:t>
       </w:r>
     </w:p>
     <w:p>
@@ -3980,16 +3859,7 @@
         <w:pStyle w:val="ListBullet"/>
       </w:pPr>
       <w:r>
-        <w:rPr>
-          <w:b/>
-        </w:rPr>
-        <w:t>Baskı Türü</w:t>
-      </w:r>
-      <w:r>
-        <w:rPr>
-          <w:b w:val="0"/>
-        </w:rPr>
-        <w:t xml:space="preserve"> (Baskısız veya Flekso 1-2 renk)</w:t>
+        <w:t>Baskı Durumu (Baskılı / Baskısız) + Renk Sayısı / Baskı Renkleri</w:t>
       </w:r>
     </w:p>
     <w:p>
@@ -4014,16 +3884,7 @@
         <w:pStyle w:val="ListBullet"/>
       </w:pPr>
       <w:r>
-        <w:rPr>
-          <w:b/>
-        </w:rPr>
-        <w:t>Dikiş Adedi</w:t>
-      </w:r>
-      <w:r>
-        <w:rPr>
-          <w:b w:val="0"/>
-        </w:rPr>
-        <w:t xml:space="preserve"> (varsa — her dikiş 2,25 TL)</w:t>
+        <w:t>Dikiş Fiyatı (TL) — toplam dikiş ücreti (yapıştırma seçildiyse 0)</w:t>
       </w:r>
     </w:p>
     <w:p>
@@ -4112,7 +3973,7 @@
           <w:color w:val="333333"/>
           <w:sz w:val="18"/>
         </w:rPr>
-        <w:t>ADIM 2: Dikiş maliyeti = 2,25 × Dikiş Adedi (yapıştırma seçtiyseniz 0)</w:t>
+        <w:t>ADIM 2: Dikiş maliyeti = girilen Dikiş Fiyatı (toplam; yapıştırmada 0)</w:t>
       </w:r>
       <w:r>
         <w:br/>

</xml_diff>